<commit_message>
feat: implement DOCX text updater and integrate with template file management
</commit_message>
<xml_diff>
--- a/backend/templates/data_engineering_intern.docx
+++ b/backend/templates/data_engineering_intern.docx
@@ -13,43 +13,39 @@
         </w:rPr>
       </w:pPr>
       <w:r>
-        <w:rPr>
-          <w:rFonts w:ascii="Calibri" w:hAnsi="Calibri" w:cs="Calibri"/>
-          <w:b/>
-          <w:bCs/>
-          <w:color w:val="000000"/>
-          <w:sz w:val="28"/>
-          <w:szCs w:val="28"/>
-        </w:rPr>
-        <w:t>URANBILEG ENKHJ</w:t>
+        <w:t>URANBILEG ENKHJARGAL</w:t>
       </w:r>
+    </w:p>
+    <w:p>
+      <w:pPr>
+        <w:spacing w:line="276" w:lineRule="auto"/>
+        <w:jc w:val="center"/>
+        <w:rPr>
+          <w:rFonts w:ascii="Calibri" w:hAnsi="Calibri" w:cs="Calibri"/>
+          <w:sz w:val="22"/>
+          <w:szCs w:val="22"/>
+        </w:rPr>
+      </w:pPr>
       <w:r>
-        <w:rPr>
-          <w:rFonts w:ascii="Calibri" w:hAnsi="Calibri" w:cs="Calibri"/>
-          <w:b/>
-          <w:bCs/>
-          <w:color w:val="000000"/>
-          <w:sz w:val="28"/>
-          <w:szCs w:val="28"/>
-        </w:rPr>
-        <w:t>A</w:t>
+        <w:t>Worcester, MA • (774) 351-8585 • UEnkhjargal@clarku.edu • linkedin.com/in/uranbileg/</w:t>
       </w:r>
+    </w:p>
+    <w:p>
+      <w:pPr>
+        <w:spacing w:line="276" w:lineRule="auto"/>
+        <w:rPr>
+          <w:rFonts w:ascii="Calibri" w:hAnsi="Calibri" w:cs="Calibri"/>
+          <w:sz w:val="22"/>
+          <w:szCs w:val="22"/>
+        </w:rPr>
+      </w:pPr>
       <w:r>
-        <w:rPr>
-          <w:rFonts w:ascii="Calibri" w:hAnsi="Calibri" w:cs="Calibri"/>
-          <w:b/>
-          <w:bCs/>
-          <w:color w:val="000000"/>
-          <w:sz w:val="28"/>
-          <w:szCs w:val="28"/>
-        </w:rPr>
-        <w:t>RGAL</w:t>
+        <w:t>[date ex:March 1, 2026]</w:t>
       </w:r>
     </w:p>
     <w:p>
       <w:pPr>
         <w:spacing w:line="276" w:lineRule="auto"/>
-        <w:jc w:val="center"/>
         <w:rPr>
           <w:rFonts w:ascii="Calibri" w:hAnsi="Calibri" w:cs="Calibri"/>
           <w:sz w:val="22"/>
@@ -57,273 +53,25 @@
         </w:rPr>
       </w:pPr>
       <w:r>
-        <w:rPr>
-          <w:rFonts w:ascii="Calibri" w:hAnsi="Calibri" w:cs="Calibri"/>
-          <w:color w:val="000000"/>
-          <w:sz w:val="22"/>
-          <w:szCs w:val="22"/>
-        </w:rPr>
-        <w:t xml:space="preserve">Worcester, MA </w:t>
+        <w:t>[company ex: Voloridge Health]</w:t>
       </w:r>
+    </w:p>
+    <w:p>
+      <w:pPr>
+        <w:spacing w:line="276" w:lineRule="auto"/>
+        <w:rPr>
+          <w:rFonts w:ascii="Calibri" w:hAnsi="Calibri" w:cs="Calibri"/>
+          <w:sz w:val="22"/>
+          <w:szCs w:val="22"/>
+        </w:rPr>
+      </w:pPr>
       <w:r>
-        <w:rPr>
-          <w:rFonts w:ascii="Calibri" w:hAnsi="Calibri" w:cs="Calibri"/>
-          <w:color w:val="000000"/>
-          <w:sz w:val="22"/>
-          <w:szCs w:val="22"/>
-        </w:rPr>
-        <w:sym w:font="Wingdings" w:char="F09F"/>
-      </w:r>
-      <w:r>
-        <w:rPr>
-          <w:rFonts w:ascii="Calibri" w:hAnsi="Calibri" w:cs="Calibri"/>
-          <w:color w:val="000000"/>
-          <w:sz w:val="22"/>
-          <w:szCs w:val="22"/>
-        </w:rPr>
-        <w:t xml:space="preserve"> (774) 351-8585 </w:t>
-      </w:r>
-      <w:r>
-        <w:rPr>
-          <w:rFonts w:ascii="Calibri" w:hAnsi="Calibri" w:cs="Calibri"/>
-          <w:color w:val="000000"/>
-          <w:sz w:val="22"/>
-          <w:szCs w:val="22"/>
-        </w:rPr>
-        <w:sym w:font="Wingdings" w:char="F09F"/>
-      </w:r>
-      <w:r>
-        <w:rPr>
-          <w:rFonts w:ascii="Calibri" w:hAnsi="Calibri" w:cs="Calibri"/>
-          <w:color w:val="000000"/>
-          <w:sz w:val="22"/>
-          <w:szCs w:val="22"/>
-        </w:rPr>
-        <w:t xml:space="preserve"> </w:t>
-      </w:r>
-      <w:hyperlink r:id="rId4" w:history="1">
-        <w:r>
-          <w:rPr>
-            <w:rStyle w:val="Hyperlink"/>
-            <w:rFonts w:ascii="Calibri" w:eastAsiaTheme="majorEastAsia" w:hAnsi="Calibri" w:cs="Calibri"/>
-            <w:sz w:val="22"/>
-            <w:szCs w:val="22"/>
-          </w:rPr>
-          <w:t>UEnkhjargal@clarku.edu</w:t>
-        </w:r>
-      </w:hyperlink>
-      <w:r>
-        <w:rPr>
-          <w:rFonts w:ascii="Calibri" w:hAnsi="Calibri" w:cs="Calibri"/>
-          <w:color w:val="000000"/>
-          <w:sz w:val="22"/>
-          <w:szCs w:val="22"/>
-        </w:rPr>
-        <w:t xml:space="preserve"> </w:t>
-      </w:r>
-      <w:r>
-        <w:rPr>
-          <w:rFonts w:ascii="Calibri" w:hAnsi="Calibri" w:cs="Calibri"/>
-          <w:color w:val="000000"/>
-          <w:sz w:val="22"/>
-          <w:szCs w:val="22"/>
-        </w:rPr>
-        <w:sym w:font="Wingdings" w:char="F09F"/>
-      </w:r>
-      <w:r>
-        <w:rPr>
-          <w:rFonts w:ascii="Calibri" w:hAnsi="Calibri" w:cs="Calibri"/>
-          <w:color w:val="000000"/>
-          <w:sz w:val="22"/>
-          <w:szCs w:val="22"/>
-        </w:rPr>
-        <w:t xml:space="preserve"> </w:t>
-      </w:r>
-      <w:hyperlink r:id="rId5" w:history="1">
-        <w:r>
-          <w:rPr>
-            <w:rStyle w:val="Hyperlink"/>
-            <w:rFonts w:ascii="Calibri" w:eastAsiaTheme="majorEastAsia" w:hAnsi="Calibri" w:cs="Calibri"/>
-            <w:sz w:val="22"/>
-            <w:szCs w:val="22"/>
-          </w:rPr>
-          <w:t>linkedin.com/in/</w:t>
-        </w:r>
-        <w:proofErr w:type="spellStart"/>
-        <w:r>
-          <w:rPr>
-            <w:rStyle w:val="Hyperlink"/>
-            <w:rFonts w:ascii="Calibri" w:eastAsiaTheme="majorEastAsia" w:hAnsi="Calibri" w:cs="Calibri"/>
-            <w:sz w:val="22"/>
-            <w:szCs w:val="22"/>
-          </w:rPr>
-          <w:t>uranbileg</w:t>
-        </w:r>
-        <w:proofErr w:type="spellEnd"/>
-        <w:r>
-          <w:rPr>
-            <w:rStyle w:val="Hyperlink"/>
-            <w:rFonts w:ascii="Calibri" w:eastAsiaTheme="majorEastAsia" w:hAnsi="Calibri" w:cs="Calibri"/>
-            <w:sz w:val="22"/>
-            <w:szCs w:val="22"/>
-          </w:rPr>
-          <w:t>/</w:t>
-        </w:r>
-      </w:hyperlink>
-    </w:p>
-    <w:p>
-      <w:pPr>
-        <w:spacing w:line="276" w:lineRule="auto"/>
-        <w:rPr>
-          <w:rFonts w:ascii="Calibri" w:hAnsi="Calibri" w:cs="Calibri"/>
-          <w:sz w:val="22"/>
-          <w:szCs w:val="22"/>
-        </w:rPr>
-      </w:pPr>
-    </w:p>
-    <w:p>
-      <w:pPr>
-        <w:spacing w:line="276" w:lineRule="auto"/>
-        <w:rPr>
-          <w:rFonts w:ascii="Calibri" w:hAnsi="Calibri" w:cs="Calibri"/>
-          <w:sz w:val="22"/>
-          <w:szCs w:val="22"/>
-        </w:rPr>
-      </w:pPr>
-      <w:r>
-        <w:rPr>
-          <w:rFonts w:ascii="Calibri" w:hAnsi="Calibri" w:cs="Calibri"/>
-          <w:sz w:val="22"/>
-          <w:szCs w:val="22"/>
-        </w:rPr>
-        <w:t xml:space="preserve">[date </w:t>
-      </w:r>
-      <w:proofErr w:type="spellStart"/>
-      <w:proofErr w:type="gramStart"/>
-      <w:r>
-        <w:rPr>
-          <w:rFonts w:ascii="Calibri" w:hAnsi="Calibri" w:cs="Calibri"/>
-          <w:sz w:val="22"/>
-          <w:szCs w:val="22"/>
-        </w:rPr>
-        <w:t>ex:</w:t>
-      </w:r>
-      <w:r>
-        <w:rPr>
-          <w:rFonts w:ascii="Calibri" w:hAnsi="Calibri" w:cs="Calibri"/>
-          <w:sz w:val="22"/>
-          <w:szCs w:val="22"/>
-        </w:rPr>
-        <w:t>March</w:t>
-      </w:r>
-      <w:proofErr w:type="spellEnd"/>
-      <w:proofErr w:type="gramEnd"/>
-      <w:r>
-        <w:rPr>
-          <w:rFonts w:ascii="Calibri" w:hAnsi="Calibri" w:cs="Calibri"/>
-          <w:sz w:val="22"/>
-          <w:szCs w:val="22"/>
-        </w:rPr>
-        <w:t xml:space="preserve"> </w:t>
-      </w:r>
-      <w:r>
-        <w:rPr>
-          <w:rFonts w:ascii="Calibri" w:hAnsi="Calibri" w:cs="Calibri"/>
-          <w:sz w:val="22"/>
-          <w:szCs w:val="22"/>
-        </w:rPr>
-        <w:t>1</w:t>
-      </w:r>
-      <w:r>
-        <w:rPr>
-          <w:rFonts w:ascii="Calibri" w:hAnsi="Calibri" w:cs="Calibri"/>
-          <w:sz w:val="22"/>
-          <w:szCs w:val="22"/>
-        </w:rPr>
-        <w:t>, 202</w:t>
-      </w:r>
-      <w:r>
-        <w:rPr>
-          <w:rFonts w:ascii="Calibri" w:hAnsi="Calibri" w:cs="Calibri"/>
-          <w:sz w:val="22"/>
-          <w:szCs w:val="22"/>
-        </w:rPr>
-        <w:t>6</w:t>
-      </w:r>
-      <w:r>
-        <w:rPr>
-          <w:rFonts w:ascii="Calibri" w:hAnsi="Calibri" w:cs="Calibri"/>
-          <w:sz w:val="22"/>
-          <w:szCs w:val="22"/>
-        </w:rPr>
-        <w:t>]</w:t>
-      </w:r>
-    </w:p>
-    <w:p>
-      <w:pPr>
-        <w:spacing w:line="276" w:lineRule="auto"/>
-        <w:rPr>
-          <w:rFonts w:ascii="Calibri" w:hAnsi="Calibri" w:cs="Calibri"/>
-          <w:sz w:val="22"/>
-          <w:szCs w:val="22"/>
-        </w:rPr>
-      </w:pPr>
-    </w:p>
-    <w:p>
-      <w:pPr>
-        <w:spacing w:line="276" w:lineRule="auto"/>
-        <w:rPr>
-          <w:rFonts w:ascii="Calibri" w:hAnsi="Calibri" w:cs="Calibri"/>
-          <w:sz w:val="22"/>
-          <w:szCs w:val="22"/>
-        </w:rPr>
-      </w:pPr>
-      <w:r>
-        <w:rPr>
-          <w:rFonts w:ascii="Calibri" w:hAnsi="Calibri" w:cs="Calibri"/>
-          <w:sz w:val="22"/>
-          <w:szCs w:val="22"/>
-        </w:rPr>
-        <w:t xml:space="preserve">[company ex: </w:t>
-      </w:r>
-      <w:proofErr w:type="spellStart"/>
-      <w:r>
-        <w:rPr>
-          <w:rFonts w:ascii="Calibri" w:hAnsi="Calibri" w:cs="Calibri"/>
-          <w:sz w:val="22"/>
-          <w:szCs w:val="22"/>
-        </w:rPr>
-        <w:t>Voloridge</w:t>
-      </w:r>
-      <w:proofErr w:type="spellEnd"/>
-      <w:r>
-        <w:rPr>
-          <w:rFonts w:ascii="Calibri" w:hAnsi="Calibri" w:cs="Calibri"/>
-          <w:sz w:val="22"/>
-          <w:szCs w:val="22"/>
-        </w:rPr>
-        <w:t xml:space="preserve"> Health]</w:t>
-      </w:r>
-    </w:p>
-    <w:p>
-      <w:pPr>
-        <w:rPr>
-          <w:rFonts w:ascii="Calibri" w:hAnsi="Calibri" w:cs="Calibri"/>
-          <w:sz w:val="22"/>
-          <w:szCs w:val="22"/>
-        </w:rPr>
-      </w:pPr>
-      <w:r>
-        <w:rPr>
-          <w:rFonts w:ascii="Calibri" w:hAnsi="Calibri" w:cs="Calibri"/>
-          <w:sz w:val="22"/>
-          <w:szCs w:val="22"/>
-        </w:rPr>
         <w:t>Hiring Team</w:t>
       </w:r>
     </w:p>
     <w:p>
       <w:pPr>
+        <w:spacing w:line="276" w:lineRule="auto"/>
         <w:rPr>
           <w:rFonts w:ascii="Calibri" w:hAnsi="Calibri" w:cs="Calibri"/>
           <w:sz w:val="22"/>
@@ -331,53 +79,18 @@
         </w:rPr>
       </w:pPr>
       <w:r>
-        <w:rPr>
-          <w:rFonts w:ascii="Calibri" w:hAnsi="Calibri" w:cs="Calibri"/>
-          <w:sz w:val="22"/>
-          <w:szCs w:val="22"/>
-        </w:rPr>
-        <w:t xml:space="preserve">[location ex: </w:t>
+        <w:t>[location ex: Jupiter, FL]</w:t>
       </w:r>
+    </w:p>
+    <w:p>
+      <w:pPr>
+        <w:rPr>
+          <w:rFonts w:ascii="Calibri" w:hAnsi="Calibri" w:cs="Calibri"/>
+          <w:sz w:val="22"/>
+          <w:szCs w:val="22"/>
+        </w:rPr>
+      </w:pPr>
       <w:r>
-        <w:rPr>
-          <w:rFonts w:ascii="Calibri" w:hAnsi="Calibri" w:cs="Calibri"/>
-          <w:sz w:val="22"/>
-          <w:szCs w:val="22"/>
-        </w:rPr>
-        <w:t>Jupiter, FL</w:t>
-      </w:r>
-      <w:r>
-        <w:rPr>
-          <w:rFonts w:ascii="Calibri" w:hAnsi="Calibri" w:cs="Calibri"/>
-          <w:sz w:val="22"/>
-          <w:szCs w:val="22"/>
-        </w:rPr>
-        <w:t>]</w:t>
-      </w:r>
-    </w:p>
-    <w:p>
-      <w:pPr>
-        <w:rPr>
-          <w:rFonts w:ascii="Calibri" w:hAnsi="Calibri" w:cs="Calibri"/>
-          <w:sz w:val="22"/>
-          <w:szCs w:val="22"/>
-        </w:rPr>
-      </w:pPr>
-    </w:p>
-    <w:p>
-      <w:pPr>
-        <w:rPr>
-          <w:rFonts w:ascii="Calibri" w:hAnsi="Calibri" w:cs="Calibri"/>
-          <w:sz w:val="22"/>
-          <w:szCs w:val="22"/>
-        </w:rPr>
-      </w:pPr>
-      <w:r>
-        <w:rPr>
-          <w:rFonts w:ascii="Calibri" w:hAnsi="Calibri" w:cs="Calibri"/>
-          <w:sz w:val="22"/>
-          <w:szCs w:val="22"/>
-        </w:rPr>
         <w:t>Dear Hiring Team,</w:t>
       </w:r>
     </w:p>
@@ -389,116 +102,24 @@
           <w:szCs w:val="22"/>
         </w:rPr>
       </w:pPr>
-    </w:p>
-    <w:p>
-      <w:pPr>
-        <w:spacing w:line="276" w:lineRule="auto"/>
-        <w:rPr>
-          <w:rFonts w:ascii="Calibri" w:hAnsi="Calibri" w:cs="Calibri"/>
-          <w:sz w:val="22"/>
-          <w:szCs w:val="22"/>
-        </w:rPr>
-      </w:pPr>
       <w:r>
-        <w:rPr>
-          <w:rFonts w:ascii="Calibri" w:hAnsi="Calibri" w:cs="Calibri"/>
-          <w:sz w:val="22"/>
-          <w:szCs w:val="22"/>
-        </w:rPr>
-        <w:t xml:space="preserve">body ex: </w:t>
+        <w:t>body ex: I am excited to apply for the [job_role] position at [company]. I am currently pursuing a Master’s degree in Computer Science at Clark University, where I focus on data pipeline development, knowledge discovery, and applied AI and machine learning.</w:t>
       </w:r>
+    </w:p>
+    <w:p>
+      <w:pPr>
+        <w:rPr>
+          <w:rFonts w:ascii="Calibri" w:hAnsi="Calibri" w:cs="Calibri"/>
+          <w:sz w:val="22"/>
+          <w:szCs w:val="22"/>
+        </w:rPr>
+      </w:pPr>
       <w:r>
-        <w:rPr>
-          <w:rFonts w:ascii="Calibri" w:hAnsi="Calibri" w:cs="Calibri"/>
-          <w:sz w:val="22"/>
-          <w:szCs w:val="22"/>
-        </w:rPr>
-        <w:t>I am excited to apply for the Health Data Engineer Intern 2026 position at</w:t>
-      </w:r>
-      <w:r>
-        <w:rPr>
-          <w:rFonts w:ascii="Calibri" w:hAnsi="Calibri" w:cs="Calibri"/>
-          <w:sz w:val="22"/>
-          <w:szCs w:val="22"/>
-        </w:rPr>
-        <w:t xml:space="preserve"> </w:t>
-      </w:r>
-      <w:r>
-        <w:rPr>
-          <w:rFonts w:ascii="Calibri" w:hAnsi="Calibri" w:cs="Calibri"/>
-          <w:sz w:val="22"/>
-          <w:szCs w:val="22"/>
-        </w:rPr>
-        <w:t>[company]</w:t>
-      </w:r>
-      <w:r>
-        <w:rPr>
-          <w:rFonts w:ascii="Calibri" w:hAnsi="Calibri" w:cs="Calibri"/>
-          <w:sz w:val="22"/>
-          <w:szCs w:val="22"/>
-        </w:rPr>
-        <w:t xml:space="preserve">. I am currently pursuing a </w:t>
-      </w:r>
-      <w:proofErr w:type="gramStart"/>
-      <w:r>
-        <w:rPr>
-          <w:rFonts w:ascii="Calibri" w:hAnsi="Calibri" w:cs="Calibri"/>
-          <w:sz w:val="22"/>
-          <w:szCs w:val="22"/>
-        </w:rPr>
-        <w:t>Master’s degree in Computer Science</w:t>
-      </w:r>
-      <w:proofErr w:type="gramEnd"/>
-      <w:r>
-        <w:rPr>
-          <w:rFonts w:ascii="Calibri" w:hAnsi="Calibri" w:cs="Calibri"/>
-          <w:sz w:val="22"/>
-          <w:szCs w:val="22"/>
-        </w:rPr>
-        <w:t xml:space="preserve"> at Clark University, where I focus on data pipeline development, knowledge discovery, and applied AI and machine learning.</w:t>
-      </w:r>
-    </w:p>
-    <w:p>
-      <w:pPr>
-        <w:spacing w:line="276" w:lineRule="auto"/>
-        <w:rPr>
-          <w:rFonts w:ascii="Calibri" w:hAnsi="Calibri" w:cs="Calibri"/>
-          <w:sz w:val="22"/>
-          <w:szCs w:val="22"/>
-        </w:rPr>
-      </w:pPr>
-    </w:p>
-    <w:p>
-      <w:pPr>
-        <w:spacing w:line="276" w:lineRule="auto"/>
-        <w:rPr>
-          <w:rFonts w:ascii="Calibri" w:hAnsi="Calibri" w:cs="Calibri"/>
-          <w:sz w:val="22"/>
-          <w:szCs w:val="22"/>
-        </w:rPr>
-      </w:pPr>
-      <w:r>
-        <w:rPr>
-          <w:rFonts w:ascii="Calibri" w:hAnsi="Calibri" w:cs="Calibri"/>
-          <w:sz w:val="22"/>
-          <w:szCs w:val="22"/>
-        </w:rPr>
         <w:t>As a Data Engineer, I designed and maintained ETL pipelines to ingest, standardize, validate, and transform structured data from multiple sources into PostgreSQL for analytics and production reporting. I implemented data quality checks, built dimensional models, and ensured reliable data foundations to support downstream analysis and decision-making. This experience strengthened my ability to build scalable, well-structured data systems.</w:t>
       </w:r>
     </w:p>
     <w:p>
       <w:pPr>
-        <w:spacing w:line="276" w:lineRule="auto"/>
-        <w:rPr>
-          <w:rFonts w:ascii="Calibri" w:hAnsi="Calibri" w:cs="Calibri"/>
-          <w:sz w:val="22"/>
-          <w:szCs w:val="22"/>
-        </w:rPr>
-      </w:pPr>
-    </w:p>
-    <w:p>
-      <w:pPr>
-        <w:spacing w:line="276" w:lineRule="auto"/>
         <w:rPr>
           <w:rFonts w:ascii="Calibri" w:hAnsi="Calibri" w:cs="Calibri"/>
           <w:sz w:val="22"/>
@@ -506,27 +127,11 @@
         </w:rPr>
       </w:pPr>
       <w:r>
-        <w:rPr>
-          <w:rFonts w:ascii="Calibri" w:hAnsi="Calibri" w:cs="Calibri"/>
-          <w:sz w:val="22"/>
-          <w:szCs w:val="22"/>
-        </w:rPr>
         <w:t>I am also developing an AI-driven drug interaction risk assessment project that integrates structured healthcare data with retrieval-based methods to support knowledge discovery and risk analysis. Through this work, I have gained a strong appreciation for the importance of robust data infrastructure behind intelligent systems. While AI and machine learning enable advanced insights, accurate data pipelines and clear stakeholder communication remain essential for meaningful impact. I have collaborated with cross-functional teams to translate business needs into structured datasets, ensuring that technical solutions align with real-world requirements.</w:t>
       </w:r>
     </w:p>
     <w:p>
       <w:pPr>
-        <w:spacing w:line="276" w:lineRule="auto"/>
-        <w:rPr>
-          <w:rFonts w:ascii="Calibri" w:hAnsi="Calibri" w:cs="Calibri"/>
-          <w:sz w:val="22"/>
-          <w:szCs w:val="22"/>
-        </w:rPr>
-      </w:pPr>
-    </w:p>
-    <w:p>
-      <w:pPr>
-        <w:spacing w:line="276" w:lineRule="auto"/>
         <w:rPr>
           <w:rFonts w:ascii="Calibri" w:hAnsi="Calibri" w:cs="Calibri"/>
           <w:sz w:val="22"/>
@@ -534,91 +139,32 @@
         </w:rPr>
       </w:pPr>
       <w:r>
-        <w:rPr>
-          <w:rFonts w:ascii="Calibri" w:hAnsi="Calibri" w:cs="Calibri"/>
-          <w:sz w:val="22"/>
-          <w:szCs w:val="22"/>
-        </w:rPr>
-        <w:t xml:space="preserve">I am eager to contribute to </w:t>
+        <w:t>I am eager to contribute to [company]’s production data pipelines and healthcare data initiatives while continuing to grow as a data engineer in a rigorous, research-driven environment.</w:t>
       </w:r>
+    </w:p>
+    <w:p>
+      <w:pPr>
+        <w:spacing w:line="276" w:lineRule="auto"/>
+        <w:rPr>
+          <w:rFonts w:ascii="Calibri" w:hAnsi="Calibri" w:cs="Calibri"/>
+          <w:sz w:val="22"/>
+          <w:szCs w:val="22"/>
+        </w:rPr>
+      </w:pPr>
       <w:r>
-        <w:rPr>
-          <w:rFonts w:ascii="Calibri" w:hAnsi="Calibri" w:cs="Calibri"/>
-          <w:sz w:val="22"/>
-          <w:szCs w:val="22"/>
-        </w:rPr>
-        <w:t>[company]</w:t>
+        <w:t>Thank you for your time and consideration.</w:t>
       </w:r>
+    </w:p>
+    <w:p>
+      <w:pPr>
+        <w:spacing w:line="276" w:lineRule="auto"/>
+        <w:rPr>
+          <w:rFonts w:ascii="Calibri" w:hAnsi="Calibri" w:cs="Calibri"/>
+          <w:sz w:val="22"/>
+          <w:szCs w:val="22"/>
+        </w:rPr>
+      </w:pPr>
       <w:r>
-        <w:rPr>
-          <w:rFonts w:ascii="Calibri" w:hAnsi="Calibri" w:cs="Calibri"/>
-          <w:sz w:val="22"/>
-          <w:szCs w:val="22"/>
-        </w:rPr>
-        <w:t xml:space="preserve">’s production data pipelines and healthcare data initiatives while continuing to grow as a data engineer in a rigorous, research-driven environment. </w:t>
-      </w:r>
-    </w:p>
-    <w:p>
-      <w:pPr>
-        <w:spacing w:line="276" w:lineRule="auto"/>
-        <w:rPr>
-          <w:rFonts w:ascii="Calibri" w:hAnsi="Calibri" w:cs="Calibri"/>
-          <w:sz w:val="22"/>
-          <w:szCs w:val="22"/>
-        </w:rPr>
-      </w:pPr>
-    </w:p>
-    <w:p>
-      <w:pPr>
-        <w:spacing w:line="276" w:lineRule="auto"/>
-        <w:rPr>
-          <w:rFonts w:ascii="Calibri" w:hAnsi="Calibri" w:cs="Calibri"/>
-          <w:sz w:val="22"/>
-          <w:szCs w:val="22"/>
-        </w:rPr>
-      </w:pPr>
-      <w:r>
-        <w:rPr>
-          <w:rFonts w:ascii="Calibri" w:hAnsi="Calibri" w:cs="Calibri"/>
-          <w:sz w:val="22"/>
-          <w:szCs w:val="22"/>
-        </w:rPr>
-        <w:t>Thank you for your time and consideration</w:t>
-      </w:r>
-      <w:r>
-        <w:rPr>
-          <w:rFonts w:ascii="Calibri" w:hAnsi="Calibri" w:cs="Calibri"/>
-          <w:sz w:val="22"/>
-          <w:szCs w:val="22"/>
-        </w:rPr>
-        <w:t>.</w:t>
-      </w:r>
-    </w:p>
-    <w:p>
-      <w:pPr>
-        <w:spacing w:line="276" w:lineRule="auto"/>
-        <w:rPr>
-          <w:rFonts w:ascii="Calibri" w:hAnsi="Calibri" w:cs="Calibri"/>
-          <w:sz w:val="22"/>
-          <w:szCs w:val="22"/>
-        </w:rPr>
-      </w:pPr>
-    </w:p>
-    <w:p>
-      <w:pPr>
-        <w:spacing w:line="276" w:lineRule="auto"/>
-        <w:rPr>
-          <w:rFonts w:ascii="Calibri" w:hAnsi="Calibri" w:cs="Calibri"/>
-          <w:sz w:val="22"/>
-          <w:szCs w:val="22"/>
-        </w:rPr>
-      </w:pPr>
-      <w:r>
-        <w:rPr>
-          <w:rFonts w:ascii="Calibri" w:hAnsi="Calibri" w:cs="Calibri"/>
-          <w:sz w:val="22"/>
-          <w:szCs w:val="22"/>
-        </w:rPr>
         <w:t>Sincerely,</w:t>
       </w:r>
     </w:p>
@@ -632,11 +178,6 @@
         </w:rPr>
       </w:pPr>
       <w:r>
-        <w:rPr>
-          <w:rFonts w:ascii="Calibri" w:hAnsi="Calibri" w:cs="Calibri"/>
-          <w:sz w:val="22"/>
-          <w:szCs w:val="22"/>
-        </w:rPr>
         <w:t>Uranbileg Enkhjargal</w:t>
       </w:r>
     </w:p>
@@ -650,11 +191,6 @@
         </w:rPr>
       </w:pPr>
       <w:r>
-        <w:rPr>
-          <w:rFonts w:ascii="Calibri" w:hAnsi="Calibri" w:cs="Calibri"/>
-          <w:sz w:val="22"/>
-          <w:szCs w:val="22"/>
-        </w:rPr>
         <w:t>Master of Computer Science, Class of 2026</w:t>
       </w:r>
     </w:p>
@@ -668,22 +204,117 @@
         </w:rPr>
       </w:pPr>
       <w:r>
-        <w:rPr>
-          <w:rFonts w:ascii="Calibri" w:hAnsi="Calibri" w:cs="Calibri"/>
-          <w:sz w:val="22"/>
-          <w:szCs w:val="22"/>
-        </w:rPr>
         <w:t>Clark University</w:t>
       </w:r>
     </w:p>
     <w:p>
       <w:pPr>
-        <w:rPr>
-          <w:rFonts w:ascii="Calibri" w:hAnsi="Calibri" w:cs="Calibri"/>
-          <w:sz w:val="22"/>
-          <w:szCs w:val="22"/>
-        </w:rPr>
-      </w:pPr>
+        <w:spacing w:line="276" w:lineRule="auto"/>
+        <w:rPr>
+          <w:rFonts w:ascii="Calibri" w:hAnsi="Calibri" w:cs="Calibri"/>
+          <w:sz w:val="22"/>
+          <w:szCs w:val="22"/>
+        </w:rPr>
+      </w:pPr>
+      <w:r/>
+    </w:p>
+    <w:p>
+      <w:pPr>
+        <w:spacing w:line="276" w:lineRule="auto"/>
+        <w:rPr>
+          <w:rFonts w:ascii="Calibri" w:hAnsi="Calibri" w:cs="Calibri"/>
+          <w:sz w:val="22"/>
+          <w:szCs w:val="22"/>
+        </w:rPr>
+      </w:pPr>
+      <w:r/>
+    </w:p>
+    <w:p>
+      <w:pPr>
+        <w:spacing w:line="276" w:lineRule="auto"/>
+        <w:rPr>
+          <w:rFonts w:ascii="Calibri" w:hAnsi="Calibri" w:cs="Calibri"/>
+          <w:sz w:val="22"/>
+          <w:szCs w:val="22"/>
+        </w:rPr>
+      </w:pPr>
+      <w:r/>
+    </w:p>
+    <w:p>
+      <w:pPr>
+        <w:spacing w:line="276" w:lineRule="auto"/>
+        <w:rPr>
+          <w:rFonts w:ascii="Calibri" w:hAnsi="Calibri" w:cs="Calibri"/>
+          <w:sz w:val="22"/>
+          <w:szCs w:val="22"/>
+        </w:rPr>
+      </w:pPr>
+      <w:r/>
+    </w:p>
+    <w:p>
+      <w:pPr>
+        <w:spacing w:line="276" w:lineRule="auto"/>
+        <w:rPr>
+          <w:rFonts w:ascii="Calibri" w:hAnsi="Calibri" w:cs="Calibri"/>
+          <w:sz w:val="22"/>
+          <w:szCs w:val="22"/>
+        </w:rPr>
+      </w:pPr>
+      <w:r/>
+    </w:p>
+    <w:p>
+      <w:pPr>
+        <w:spacing w:line="276" w:lineRule="auto"/>
+        <w:rPr>
+          <w:rFonts w:ascii="Calibri" w:hAnsi="Calibri" w:cs="Calibri"/>
+          <w:sz w:val="22"/>
+          <w:szCs w:val="22"/>
+        </w:rPr>
+      </w:pPr>
+      <w:r/>
+    </w:p>
+    <w:p>
+      <w:pPr>
+        <w:spacing w:line="276" w:lineRule="auto"/>
+        <w:rPr>
+          <w:rFonts w:ascii="Calibri" w:hAnsi="Calibri" w:cs="Calibri"/>
+          <w:sz w:val="22"/>
+          <w:szCs w:val="22"/>
+        </w:rPr>
+      </w:pPr>
+      <w:r/>
+    </w:p>
+    <w:p>
+      <w:pPr>
+        <w:spacing w:line="276" w:lineRule="auto"/>
+        <w:rPr>
+          <w:rFonts w:ascii="Calibri" w:hAnsi="Calibri" w:cs="Calibri"/>
+          <w:sz w:val="22"/>
+          <w:szCs w:val="22"/>
+        </w:rPr>
+      </w:pPr>
+      <w:r/>
+    </w:p>
+    <w:p>
+      <w:pPr>
+        <w:spacing w:line="276" w:lineRule="auto"/>
+        <w:rPr>
+          <w:rFonts w:ascii="Calibri" w:hAnsi="Calibri" w:cs="Calibri"/>
+          <w:sz w:val="22"/>
+          <w:szCs w:val="22"/>
+        </w:rPr>
+      </w:pPr>
+      <w:r/>
+    </w:p>
+    <w:p>
+      <w:pPr>
+        <w:rPr>
+          <w:rFonts w:ascii="Calibri" w:hAnsi="Calibri" w:cs="Calibri"/>
+          <w:sz w:val="22"/>
+          <w:szCs w:val="22"/>
+        </w:rPr>
+      </w:pPr>
+      <w:r/>
     </w:p>
     <w:sectPr>
       <w:type w:val="continuous"/>

</xml_diff>

<commit_message>
feat: enhance export functionality with separate directories for Word and PDF outputs
</commit_message>
<xml_diff>
--- a/backend/templates/data_engineering_intern.docx
+++ b/backend/templates/data_engineering_intern.docx
@@ -13,7 +13,37 @@
         </w:rPr>
       </w:pPr>
       <w:r>
-        <w:t>URANBILEG ENKHJARGAL</w:t>
+        <w:rPr>
+          <w:rFonts w:ascii="Calibri" w:hAnsi="Calibri" w:cs="Calibri"/>
+          <w:b/>
+          <w:bCs/>
+          <w:color w:val="000000"/>
+          <w:sz w:val="28"/>
+          <w:szCs w:val="28"/>
+        </w:rPr>
+        <w:t>URANBILEG ENKHJ</w:t>
+      </w:r>
+      <w:r>
+        <w:rPr>
+          <w:rFonts w:ascii="Calibri" w:hAnsi="Calibri" w:cs="Calibri"/>
+          <w:b/>
+          <w:bCs/>
+          <w:color w:val="000000"/>
+          <w:sz w:val="28"/>
+          <w:szCs w:val="28"/>
+        </w:rPr>
+        <w:t>A</w:t>
+      </w:r>
+      <w:r>
+        <w:rPr>
+          <w:rFonts w:ascii="Calibri" w:hAnsi="Calibri" w:cs="Calibri"/>
+          <w:b/>
+          <w:bCs/>
+          <w:color w:val="000000"/>
+          <w:sz w:val="28"/>
+          <w:szCs w:val="28"/>
+        </w:rPr>
+        <w:t>RGAL</w:t>
       </w:r>
     </w:p>
     <w:p>
@@ -27,8 +57,119 @@
         </w:rPr>
       </w:pPr>
       <w:r>
-        <w:t>Worcester, MA • (774) 351-8585 • UEnkhjargal@clarku.edu • linkedin.com/in/uranbileg/</w:t>
-      </w:r>
+        <w:rPr>
+          <w:rFonts w:ascii="Calibri" w:hAnsi="Calibri" w:cs="Calibri"/>
+          <w:color w:val="000000"/>
+          <w:sz w:val="22"/>
+          <w:szCs w:val="22"/>
+        </w:rPr>
+        <w:t xml:space="preserve">Worcester, MA </w:t>
+      </w:r>
+      <w:r>
+        <w:rPr>
+          <w:rFonts w:ascii="Calibri" w:hAnsi="Calibri" w:cs="Calibri"/>
+          <w:color w:val="000000"/>
+          <w:sz w:val="22"/>
+          <w:szCs w:val="22"/>
+        </w:rPr>
+        <w:sym w:font="Wingdings" w:char="F09F"/>
+      </w:r>
+      <w:r>
+        <w:rPr>
+          <w:rFonts w:ascii="Calibri" w:hAnsi="Calibri" w:cs="Calibri"/>
+          <w:color w:val="000000"/>
+          <w:sz w:val="22"/>
+          <w:szCs w:val="22"/>
+        </w:rPr>
+        <w:t xml:space="preserve"> (774) 351-8585 </w:t>
+      </w:r>
+      <w:r>
+        <w:rPr>
+          <w:rFonts w:ascii="Calibri" w:hAnsi="Calibri" w:cs="Calibri"/>
+          <w:color w:val="000000"/>
+          <w:sz w:val="22"/>
+          <w:szCs w:val="22"/>
+        </w:rPr>
+        <w:sym w:font="Wingdings" w:char="F09F"/>
+      </w:r>
+      <w:r>
+        <w:rPr>
+          <w:rFonts w:ascii="Calibri" w:hAnsi="Calibri" w:cs="Calibri"/>
+          <w:color w:val="000000"/>
+          <w:sz w:val="22"/>
+          <w:szCs w:val="22"/>
+        </w:rPr>
+        <w:t xml:space="preserve"> </w:t>
+      </w:r>
+      <w:hyperlink r:id="rId4" w:history="1">
+        <w:r>
+          <w:rPr>
+            <w:rStyle w:val="Hyperlink"/>
+            <w:rFonts w:ascii="Calibri" w:eastAsiaTheme="majorEastAsia" w:hAnsi="Calibri" w:cs="Calibri"/>
+            <w:sz w:val="22"/>
+            <w:szCs w:val="22"/>
+          </w:rPr>
+          <w:t>UEnkhjargal@clarku.edu</w:t>
+        </w:r>
+      </w:hyperlink>
+      <w:r>
+        <w:rPr>
+          <w:rFonts w:ascii="Calibri" w:hAnsi="Calibri" w:cs="Calibri"/>
+          <w:color w:val="000000"/>
+          <w:sz w:val="22"/>
+          <w:szCs w:val="22"/>
+        </w:rPr>
+        <w:t xml:space="preserve"> </w:t>
+      </w:r>
+      <w:r>
+        <w:rPr>
+          <w:rFonts w:ascii="Calibri" w:hAnsi="Calibri" w:cs="Calibri"/>
+          <w:color w:val="000000"/>
+          <w:sz w:val="22"/>
+          <w:szCs w:val="22"/>
+        </w:rPr>
+        <w:sym w:font="Wingdings" w:char="F09F"/>
+      </w:r>
+      <w:r>
+        <w:rPr>
+          <w:rFonts w:ascii="Calibri" w:hAnsi="Calibri" w:cs="Calibri"/>
+          <w:color w:val="000000"/>
+          <w:sz w:val="22"/>
+          <w:szCs w:val="22"/>
+        </w:rPr>
+        <w:t xml:space="preserve"> </w:t>
+      </w:r>
+      <w:hyperlink r:id="rId5" w:history="1">
+        <w:r>
+          <w:rPr>
+            <w:rStyle w:val="Hyperlink"/>
+            <w:rFonts w:ascii="Calibri" w:eastAsiaTheme="majorEastAsia" w:hAnsi="Calibri" w:cs="Calibri"/>
+            <w:sz w:val="22"/>
+            <w:szCs w:val="22"/>
+          </w:rPr>
+          <w:t>linkedin.com/in/</w:t>
+        </w:r>
+        <w:proofErr w:type="spellStart"/>
+        <w:r>
+          <w:rPr>
+            <w:rStyle w:val="Hyperlink"/>
+            <w:rFonts w:ascii="Calibri" w:eastAsiaTheme="majorEastAsia" w:hAnsi="Calibri" w:cs="Calibri"/>
+            <w:sz w:val="22"/>
+            <w:szCs w:val="22"/>
+          </w:rPr>
+          <w:t>uranbileg</w:t>
+        </w:r>
+        <w:proofErr w:type="spellEnd"/>
+        <w:r>
+          <w:rPr>
+            <w:rStyle w:val="Hyperlink"/>
+            <w:rFonts w:ascii="Calibri" w:eastAsiaTheme="majorEastAsia" w:hAnsi="Calibri" w:cs="Calibri"/>
+            <w:sz w:val="22"/>
+            <w:szCs w:val="22"/>
+          </w:rPr>
+          <w:t>/</w:t>
+        </w:r>
+      </w:hyperlink>
     </w:p>
     <w:p>
       <w:pPr>
@@ -39,9 +180,6 @@
           <w:szCs w:val="22"/>
         </w:rPr>
       </w:pPr>
-      <w:r>
-        <w:t>[date ex:March 1, 2026]</w:t>
-      </w:r>
     </w:p>
     <w:p>
       <w:pPr>
@@ -53,7 +191,72 @@
         </w:rPr>
       </w:pPr>
       <w:r>
-        <w:t>[company ex: Voloridge Health]</w:t>
+        <w:rPr>
+          <w:rFonts w:ascii="Calibri" w:hAnsi="Calibri" w:cs="Calibri"/>
+          <w:sz w:val="22"/>
+          <w:szCs w:val="22"/>
+        </w:rPr>
+        <w:t xml:space="preserve">[date </w:t>
+      </w:r>
+      <w:proofErr w:type="spellStart"/>
+      <w:proofErr w:type="gramStart"/>
+      <w:r>
+        <w:rPr>
+          <w:rFonts w:ascii="Calibri" w:hAnsi="Calibri" w:cs="Calibri"/>
+          <w:sz w:val="22"/>
+          <w:szCs w:val="22"/>
+        </w:rPr>
+        <w:t>ex:</w:t>
+      </w:r>
+      <w:r>
+        <w:rPr>
+          <w:rFonts w:ascii="Calibri" w:hAnsi="Calibri" w:cs="Calibri"/>
+          <w:sz w:val="22"/>
+          <w:szCs w:val="22"/>
+        </w:rPr>
+        <w:t>March</w:t>
+      </w:r>
+      <w:proofErr w:type="spellEnd"/>
+      <w:proofErr w:type="gramEnd"/>
+      <w:r>
+        <w:rPr>
+          <w:rFonts w:ascii="Calibri" w:hAnsi="Calibri" w:cs="Calibri"/>
+          <w:sz w:val="22"/>
+          <w:szCs w:val="22"/>
+        </w:rPr>
+        <w:t xml:space="preserve"> </w:t>
+      </w:r>
+      <w:r>
+        <w:rPr>
+          <w:rFonts w:ascii="Calibri" w:hAnsi="Calibri" w:cs="Calibri"/>
+          <w:sz w:val="22"/>
+          <w:szCs w:val="22"/>
+        </w:rPr>
+        <w:t>1</w:t>
+      </w:r>
+      <w:r>
+        <w:rPr>
+          <w:rFonts w:ascii="Calibri" w:hAnsi="Calibri" w:cs="Calibri"/>
+          <w:sz w:val="22"/>
+          <w:szCs w:val="22"/>
+        </w:rPr>
+        <w:t>, 202</w:t>
+      </w:r>
+      <w:r>
+        <w:rPr>
+          <w:rFonts w:ascii="Calibri" w:hAnsi="Calibri" w:cs="Calibri"/>
+          <w:sz w:val="22"/>
+          <w:szCs w:val="22"/>
+        </w:rPr>
+        <w:t>6</w:t>
+      </w:r>
+      <w:r>
+        <w:rPr>
+          <w:rFonts w:ascii="Calibri" w:hAnsi="Calibri" w:cs="Calibri"/>
+          <w:sz w:val="22"/>
+          <w:szCs w:val="22"/>
+        </w:rPr>
+        <w:t>]</w:t>
       </w:r>
     </w:p>
     <w:p>
@@ -65,12 +268,130 @@
           <w:szCs w:val="22"/>
         </w:rPr>
       </w:pPr>
-      <w:r>
+    </w:p>
+    <w:p>
+      <w:pPr>
+        <w:spacing w:line="276" w:lineRule="auto"/>
+        <w:rPr>
+          <w:rFonts w:ascii="Calibri" w:hAnsi="Calibri" w:cs="Calibri"/>
+          <w:sz w:val="22"/>
+          <w:szCs w:val="22"/>
+        </w:rPr>
+      </w:pPr>
+      <w:r>
+        <w:rPr>
+          <w:rFonts w:ascii="Calibri" w:hAnsi="Calibri" w:cs="Calibri"/>
+          <w:sz w:val="22"/>
+          <w:szCs w:val="22"/>
+        </w:rPr>
+        <w:t xml:space="preserve">[company ex: </w:t>
+      </w:r>
+      <w:proofErr w:type="spellStart"/>
+      <w:r>
+        <w:rPr>
+          <w:rFonts w:ascii="Calibri" w:hAnsi="Calibri" w:cs="Calibri"/>
+          <w:sz w:val="22"/>
+          <w:szCs w:val="22"/>
+        </w:rPr>
+        <w:t>Voloridge</w:t>
+      </w:r>
+      <w:proofErr w:type="spellEnd"/>
+      <w:r>
+        <w:rPr>
+          <w:rFonts w:ascii="Calibri" w:hAnsi="Calibri" w:cs="Calibri"/>
+          <w:sz w:val="22"/>
+          <w:szCs w:val="22"/>
+        </w:rPr>
+        <w:t xml:space="preserve"> Health]</w:t>
+      </w:r>
+    </w:p>
+    <w:p>
+      <w:pPr>
+        <w:rPr>
+          <w:rFonts w:ascii="Calibri" w:hAnsi="Calibri" w:cs="Calibri"/>
+          <w:sz w:val="22"/>
+          <w:szCs w:val="22"/>
+        </w:rPr>
+      </w:pPr>
+      <w:r>
+        <w:rPr>
+          <w:rFonts w:ascii="Calibri" w:hAnsi="Calibri" w:cs="Calibri"/>
+          <w:sz w:val="22"/>
+          <w:szCs w:val="22"/>
+        </w:rPr>
         <w:t>Hiring Team</w:t>
       </w:r>
     </w:p>
     <w:p>
       <w:pPr>
+        <w:rPr>
+          <w:rFonts w:ascii="Calibri" w:hAnsi="Calibri" w:cs="Calibri"/>
+          <w:sz w:val="22"/>
+          <w:szCs w:val="22"/>
+        </w:rPr>
+      </w:pPr>
+      <w:r>
+        <w:rPr>
+          <w:rFonts w:ascii="Calibri" w:hAnsi="Calibri" w:cs="Calibri"/>
+          <w:sz w:val="22"/>
+          <w:szCs w:val="22"/>
+        </w:rPr>
+        <w:t xml:space="preserve">[location ex: </w:t>
+      </w:r>
+      <w:r>
+        <w:rPr>
+          <w:rFonts w:ascii="Calibri" w:hAnsi="Calibri" w:cs="Calibri"/>
+          <w:sz w:val="22"/>
+          <w:szCs w:val="22"/>
+        </w:rPr>
+        <w:t>Jupiter, FL</w:t>
+      </w:r>
+      <w:r>
+        <w:rPr>
+          <w:rFonts w:ascii="Calibri" w:hAnsi="Calibri" w:cs="Calibri"/>
+          <w:sz w:val="22"/>
+          <w:szCs w:val="22"/>
+        </w:rPr>
+        <w:t>]</w:t>
+      </w:r>
+    </w:p>
+    <w:p>
+      <w:pPr>
+        <w:rPr>
+          <w:rFonts w:ascii="Calibri" w:hAnsi="Calibri" w:cs="Calibri"/>
+          <w:sz w:val="22"/>
+          <w:szCs w:val="22"/>
+        </w:rPr>
+      </w:pPr>
+    </w:p>
+    <w:p>
+      <w:pPr>
+        <w:rPr>
+          <w:rFonts w:ascii="Calibri" w:hAnsi="Calibri" w:cs="Calibri"/>
+          <w:sz w:val="22"/>
+          <w:szCs w:val="22"/>
+        </w:rPr>
+      </w:pPr>
+      <w:r>
+        <w:rPr>
+          <w:rFonts w:ascii="Calibri" w:hAnsi="Calibri" w:cs="Calibri"/>
+          <w:sz w:val="22"/>
+          <w:szCs w:val="22"/>
+        </w:rPr>
+        <w:t>Dear Hiring Team,</w:t>
+      </w:r>
+    </w:p>
+    <w:p>
+      <w:pPr>
+        <w:rPr>
+          <w:rFonts w:ascii="Calibri" w:hAnsi="Calibri" w:cs="Calibri"/>
+          <w:sz w:val="22"/>
+          <w:szCs w:val="22"/>
+        </w:rPr>
+      </w:pPr>
+    </w:p>
+    <w:p>
+      <w:pPr>
         <w:spacing w:line="276" w:lineRule="auto"/>
         <w:rPr>
           <w:rFonts w:ascii="Calibri" w:hAnsi="Calibri" w:cs="Calibri"/>
@@ -79,71 +400,122 @@
         </w:rPr>
       </w:pPr>
       <w:r>
-        <w:t>[location ex: Jupiter, FL]</w:t>
-      </w:r>
-    </w:p>
-    <w:p>
-      <w:pPr>
-        <w:rPr>
-          <w:rFonts w:ascii="Calibri" w:hAnsi="Calibri" w:cs="Calibri"/>
-          <w:sz w:val="22"/>
-          <w:szCs w:val="22"/>
-        </w:rPr>
-      </w:pPr>
-      <w:r>
-        <w:t>Dear Hiring Team,</w:t>
-      </w:r>
-    </w:p>
-    <w:p>
-      <w:pPr>
-        <w:rPr>
-          <w:rFonts w:ascii="Calibri" w:hAnsi="Calibri" w:cs="Calibri"/>
-          <w:sz w:val="22"/>
-          <w:szCs w:val="22"/>
-        </w:rPr>
-      </w:pPr>
-      <w:r>
-        <w:t>body ex: I am excited to apply for the [job_role] position at [company]. I am currently pursuing a Master’s degree in Computer Science at Clark University, where I focus on data pipeline development, knowledge discovery, and applied AI and machine learning.</w:t>
-      </w:r>
-    </w:p>
-    <w:p>
-      <w:pPr>
-        <w:rPr>
-          <w:rFonts w:ascii="Calibri" w:hAnsi="Calibri" w:cs="Calibri"/>
-          <w:sz w:val="22"/>
-          <w:szCs w:val="22"/>
-        </w:rPr>
-      </w:pPr>
-      <w:r>
+        <w:rPr>
+          <w:rFonts w:ascii="Calibri" w:hAnsi="Calibri" w:cs="Calibri"/>
+          <w:sz w:val="22"/>
+          <w:szCs w:val="22"/>
+        </w:rPr>
+        <w:t xml:space="preserve">body ex: </w:t>
+      </w:r>
+      <w:r>
+        <w:rPr>
+          <w:rFonts w:ascii="Calibri" w:hAnsi="Calibri" w:cs="Calibri"/>
+          <w:sz w:val="22"/>
+          <w:szCs w:val="22"/>
+        </w:rPr>
+        <w:t>I am excited to apply for the Health Data Engineer Intern 2026 position at</w:t>
+      </w:r>
+      <w:r>
+        <w:rPr>
+          <w:rFonts w:ascii="Calibri" w:hAnsi="Calibri" w:cs="Calibri"/>
+          <w:sz w:val="22"/>
+          <w:szCs w:val="22"/>
+        </w:rPr>
+        <w:t xml:space="preserve"> </w:t>
+      </w:r>
+      <w:r>
+        <w:rPr>
+          <w:rFonts w:ascii="Calibri" w:hAnsi="Calibri" w:cs="Calibri"/>
+          <w:sz w:val="22"/>
+          <w:szCs w:val="22"/>
+        </w:rPr>
+        <w:t>[company]</w:t>
+      </w:r>
+      <w:r>
+        <w:rPr>
+          <w:rFonts w:ascii="Calibri" w:hAnsi="Calibri" w:cs="Calibri"/>
+          <w:sz w:val="22"/>
+          <w:szCs w:val="22"/>
+        </w:rPr>
+        <w:t xml:space="preserve">. I am currently pursuing a </w:t>
+      </w:r>
+      <w:proofErr w:type="gramStart"/>
+      <w:r>
+        <w:rPr>
+          <w:rFonts w:ascii="Calibri" w:hAnsi="Calibri" w:cs="Calibri"/>
+          <w:sz w:val="22"/>
+          <w:szCs w:val="22"/>
+        </w:rPr>
+        <w:t>Master’s degree in Computer Science</w:t>
+      </w:r>
+      <w:proofErr w:type="gramEnd"/>
+      <w:r>
+        <w:rPr>
+          <w:rFonts w:ascii="Calibri" w:hAnsi="Calibri" w:cs="Calibri"/>
+          <w:sz w:val="22"/>
+          <w:szCs w:val="22"/>
+        </w:rPr>
+        <w:t xml:space="preserve"> at Clark University, where I focus on data pipeline development, knowledge discovery, and applied AI and machine learning.</w:t>
+      </w:r>
+    </w:p>
+    <w:p>
+      <w:pPr>
+        <w:spacing w:line="276" w:lineRule="auto"/>
+        <w:rPr>
+          <w:rFonts w:ascii="Calibri" w:hAnsi="Calibri" w:cs="Calibri"/>
+          <w:sz w:val="22"/>
+          <w:szCs w:val="22"/>
+        </w:rPr>
+      </w:pPr>
+    </w:p>
+    <w:p>
+      <w:pPr>
+        <w:spacing w:line="276" w:lineRule="auto"/>
+        <w:rPr>
+          <w:rFonts w:ascii="Calibri" w:hAnsi="Calibri" w:cs="Calibri"/>
+          <w:sz w:val="22"/>
+          <w:szCs w:val="22"/>
+        </w:rPr>
+      </w:pPr>
+      <w:r>
+        <w:rPr>
+          <w:rFonts w:ascii="Calibri" w:hAnsi="Calibri" w:cs="Calibri"/>
+          <w:sz w:val="22"/>
+          <w:szCs w:val="22"/>
+        </w:rPr>
         <w:t>As a Data Engineer, I designed and maintained ETL pipelines to ingest, standardize, validate, and transform structured data from multiple sources into PostgreSQL for analytics and production reporting. I implemented data quality checks, built dimensional models, and ensured reliable data foundations to support downstream analysis and decision-making. This experience strengthened my ability to build scalable, well-structured data systems.</w:t>
       </w:r>
     </w:p>
     <w:p>
       <w:pPr>
-        <w:rPr>
-          <w:rFonts w:ascii="Calibri" w:hAnsi="Calibri" w:cs="Calibri"/>
-          <w:sz w:val="22"/>
-          <w:szCs w:val="22"/>
-        </w:rPr>
-      </w:pPr>
-      <w:r>
+        <w:spacing w:line="276" w:lineRule="auto"/>
+        <w:rPr>
+          <w:rFonts w:ascii="Calibri" w:hAnsi="Calibri" w:cs="Calibri"/>
+          <w:sz w:val="22"/>
+          <w:szCs w:val="22"/>
+        </w:rPr>
+      </w:pPr>
+    </w:p>
+    <w:p>
+      <w:pPr>
+        <w:spacing w:line="276" w:lineRule="auto"/>
+        <w:rPr>
+          <w:rFonts w:ascii="Calibri" w:hAnsi="Calibri" w:cs="Calibri"/>
+          <w:sz w:val="22"/>
+          <w:szCs w:val="22"/>
+        </w:rPr>
+      </w:pPr>
+      <w:r>
+        <w:rPr>
+          <w:rFonts w:ascii="Calibri" w:hAnsi="Calibri" w:cs="Calibri"/>
+          <w:sz w:val="22"/>
+          <w:szCs w:val="22"/>
+        </w:rPr>
         <w:t>I am also developing an AI-driven drug interaction risk assessment project that integrates structured healthcare data with retrieval-based methods to support knowledge discovery and risk analysis. Through this work, I have gained a strong appreciation for the importance of robust data infrastructure behind intelligent systems. While AI and machine learning enable advanced insights, accurate data pipelines and clear stakeholder communication remain essential for meaningful impact. I have collaborated with cross-functional teams to translate business needs into structured datasets, ensuring that technical solutions align with real-world requirements.</w:t>
       </w:r>
     </w:p>
     <w:p>
       <w:pPr>
-        <w:rPr>
-          <w:rFonts w:ascii="Calibri" w:hAnsi="Calibri" w:cs="Calibri"/>
-          <w:sz w:val="22"/>
-          <w:szCs w:val="22"/>
-        </w:rPr>
-      </w:pPr>
-      <w:r>
-        <w:t>I am eager to contribute to [company]’s production data pipelines and healthcare data initiatives while continuing to grow as a data engineer in a rigorous, research-driven environment.</w:t>
-      </w:r>
-    </w:p>
-    <w:p>
-      <w:pPr>
         <w:spacing w:line="276" w:lineRule="auto"/>
         <w:rPr>
           <w:rFonts w:ascii="Calibri" w:hAnsi="Calibri" w:cs="Calibri"/>
@@ -151,9 +523,6 @@
           <w:szCs w:val="22"/>
         </w:rPr>
       </w:pPr>
-      <w:r>
-        <w:t>Thank you for your time and consideration.</w:t>
-      </w:r>
     </w:p>
     <w:p>
       <w:pPr>
@@ -165,6 +534,91 @@
         </w:rPr>
       </w:pPr>
       <w:r>
+        <w:rPr>
+          <w:rFonts w:ascii="Calibri" w:hAnsi="Calibri" w:cs="Calibri"/>
+          <w:sz w:val="22"/>
+          <w:szCs w:val="22"/>
+        </w:rPr>
+        <w:t xml:space="preserve">I am eager to contribute to </w:t>
+      </w:r>
+      <w:r>
+        <w:rPr>
+          <w:rFonts w:ascii="Calibri" w:hAnsi="Calibri" w:cs="Calibri"/>
+          <w:sz w:val="22"/>
+          <w:szCs w:val="22"/>
+        </w:rPr>
+        <w:t>[company]</w:t>
+      </w:r>
+      <w:r>
+        <w:rPr>
+          <w:rFonts w:ascii="Calibri" w:hAnsi="Calibri" w:cs="Calibri"/>
+          <w:sz w:val="22"/>
+          <w:szCs w:val="22"/>
+        </w:rPr>
+        <w:t xml:space="preserve">’s production data pipelines and healthcare data initiatives while continuing to grow as a data engineer in a rigorous, research-driven environment. </w:t>
+      </w:r>
+    </w:p>
+    <w:p>
+      <w:pPr>
+        <w:spacing w:line="276" w:lineRule="auto"/>
+        <w:rPr>
+          <w:rFonts w:ascii="Calibri" w:hAnsi="Calibri" w:cs="Calibri"/>
+          <w:sz w:val="22"/>
+          <w:szCs w:val="22"/>
+        </w:rPr>
+      </w:pPr>
+    </w:p>
+    <w:p>
+      <w:pPr>
+        <w:spacing w:line="276" w:lineRule="auto"/>
+        <w:rPr>
+          <w:rFonts w:ascii="Calibri" w:hAnsi="Calibri" w:cs="Calibri"/>
+          <w:sz w:val="22"/>
+          <w:szCs w:val="22"/>
+        </w:rPr>
+      </w:pPr>
+      <w:r>
+        <w:rPr>
+          <w:rFonts w:ascii="Calibri" w:hAnsi="Calibri" w:cs="Calibri"/>
+          <w:sz w:val="22"/>
+          <w:szCs w:val="22"/>
+        </w:rPr>
+        <w:t>Thank you for your time and consideration</w:t>
+      </w:r>
+      <w:r>
+        <w:rPr>
+          <w:rFonts w:ascii="Calibri" w:hAnsi="Calibri" w:cs="Calibri"/>
+          <w:sz w:val="22"/>
+          <w:szCs w:val="22"/>
+        </w:rPr>
+        <w:t>.</w:t>
+      </w:r>
+    </w:p>
+    <w:p>
+      <w:pPr>
+        <w:spacing w:line="276" w:lineRule="auto"/>
+        <w:rPr>
+          <w:rFonts w:ascii="Calibri" w:hAnsi="Calibri" w:cs="Calibri"/>
+          <w:sz w:val="22"/>
+          <w:szCs w:val="22"/>
+        </w:rPr>
+      </w:pPr>
+    </w:p>
+    <w:p>
+      <w:pPr>
+        <w:spacing w:line="276" w:lineRule="auto"/>
+        <w:rPr>
+          <w:rFonts w:ascii="Calibri" w:hAnsi="Calibri" w:cs="Calibri"/>
+          <w:sz w:val="22"/>
+          <w:szCs w:val="22"/>
+        </w:rPr>
+      </w:pPr>
+      <w:r>
+        <w:rPr>
+          <w:rFonts w:ascii="Calibri" w:hAnsi="Calibri" w:cs="Calibri"/>
+          <w:sz w:val="22"/>
+          <w:szCs w:val="22"/>
+        </w:rPr>
         <w:t>Sincerely,</w:t>
       </w:r>
     </w:p>
@@ -178,6 +632,11 @@
         </w:rPr>
       </w:pPr>
       <w:r>
+        <w:rPr>
+          <w:rFonts w:ascii="Calibri" w:hAnsi="Calibri" w:cs="Calibri"/>
+          <w:sz w:val="22"/>
+          <w:szCs w:val="22"/>
+        </w:rPr>
         <w:t>Uranbileg Enkhjargal</w:t>
       </w:r>
     </w:p>
@@ -191,6 +650,11 @@
         </w:rPr>
       </w:pPr>
       <w:r>
+        <w:rPr>
+          <w:rFonts w:ascii="Calibri" w:hAnsi="Calibri" w:cs="Calibri"/>
+          <w:sz w:val="22"/>
+          <w:szCs w:val="22"/>
+        </w:rPr>
         <w:t>Master of Computer Science, Class of 2026</w:t>
       </w:r>
     </w:p>
@@ -204,117 +668,22 @@
         </w:rPr>
       </w:pPr>
       <w:r>
+        <w:rPr>
+          <w:rFonts w:ascii="Calibri" w:hAnsi="Calibri" w:cs="Calibri"/>
+          <w:sz w:val="22"/>
+          <w:szCs w:val="22"/>
+        </w:rPr>
         <w:t>Clark University</w:t>
       </w:r>
     </w:p>
     <w:p>
       <w:pPr>
-        <w:spacing w:line="276" w:lineRule="auto"/>
-        <w:rPr>
-          <w:rFonts w:ascii="Calibri" w:hAnsi="Calibri" w:cs="Calibri"/>
-          <w:sz w:val="22"/>
-          <w:szCs w:val="22"/>
-        </w:rPr>
-      </w:pPr>
-      <w:r/>
-    </w:p>
-    <w:p>
-      <w:pPr>
-        <w:spacing w:line="276" w:lineRule="auto"/>
-        <w:rPr>
-          <w:rFonts w:ascii="Calibri" w:hAnsi="Calibri" w:cs="Calibri"/>
-          <w:sz w:val="22"/>
-          <w:szCs w:val="22"/>
-        </w:rPr>
-      </w:pPr>
-      <w:r/>
-    </w:p>
-    <w:p>
-      <w:pPr>
-        <w:spacing w:line="276" w:lineRule="auto"/>
-        <w:rPr>
-          <w:rFonts w:ascii="Calibri" w:hAnsi="Calibri" w:cs="Calibri"/>
-          <w:sz w:val="22"/>
-          <w:szCs w:val="22"/>
-        </w:rPr>
-      </w:pPr>
-      <w:r/>
-    </w:p>
-    <w:p>
-      <w:pPr>
-        <w:spacing w:line="276" w:lineRule="auto"/>
-        <w:rPr>
-          <w:rFonts w:ascii="Calibri" w:hAnsi="Calibri" w:cs="Calibri"/>
-          <w:sz w:val="22"/>
-          <w:szCs w:val="22"/>
-        </w:rPr>
-      </w:pPr>
-      <w:r/>
-    </w:p>
-    <w:p>
-      <w:pPr>
-        <w:spacing w:line="276" w:lineRule="auto"/>
-        <w:rPr>
-          <w:rFonts w:ascii="Calibri" w:hAnsi="Calibri" w:cs="Calibri"/>
-          <w:sz w:val="22"/>
-          <w:szCs w:val="22"/>
-        </w:rPr>
-      </w:pPr>
-      <w:r/>
-    </w:p>
-    <w:p>
-      <w:pPr>
-        <w:spacing w:line="276" w:lineRule="auto"/>
-        <w:rPr>
-          <w:rFonts w:ascii="Calibri" w:hAnsi="Calibri" w:cs="Calibri"/>
-          <w:sz w:val="22"/>
-          <w:szCs w:val="22"/>
-        </w:rPr>
-      </w:pPr>
-      <w:r/>
-    </w:p>
-    <w:p>
-      <w:pPr>
-        <w:spacing w:line="276" w:lineRule="auto"/>
-        <w:rPr>
-          <w:rFonts w:ascii="Calibri" w:hAnsi="Calibri" w:cs="Calibri"/>
-          <w:sz w:val="22"/>
-          <w:szCs w:val="22"/>
-        </w:rPr>
-      </w:pPr>
-      <w:r/>
-    </w:p>
-    <w:p>
-      <w:pPr>
-        <w:spacing w:line="276" w:lineRule="auto"/>
-        <w:rPr>
-          <w:rFonts w:ascii="Calibri" w:hAnsi="Calibri" w:cs="Calibri"/>
-          <w:sz w:val="22"/>
-          <w:szCs w:val="22"/>
-        </w:rPr>
-      </w:pPr>
-      <w:r/>
-    </w:p>
-    <w:p>
-      <w:pPr>
-        <w:spacing w:line="276" w:lineRule="auto"/>
-        <w:rPr>
-          <w:rFonts w:ascii="Calibri" w:hAnsi="Calibri" w:cs="Calibri"/>
-          <w:sz w:val="22"/>
-          <w:szCs w:val="22"/>
-        </w:rPr>
-      </w:pPr>
-      <w:r/>
-    </w:p>
-    <w:p>
-      <w:pPr>
-        <w:rPr>
-          <w:rFonts w:ascii="Calibri" w:hAnsi="Calibri" w:cs="Calibri"/>
-          <w:sz w:val="22"/>
-          <w:szCs w:val="22"/>
-        </w:rPr>
-      </w:pPr>
-      <w:r/>
+        <w:rPr>
+          <w:rFonts w:ascii="Calibri" w:hAnsi="Calibri" w:cs="Calibri"/>
+          <w:sz w:val="22"/>
+          <w:szCs w:val="22"/>
+        </w:rPr>
+      </w:pPr>
     </w:p>
     <w:sectPr>
       <w:type w:val="continuous"/>

</xml_diff>